<commit_message>
Stop tracking unused scripts. Update gitignore
</commit_message>
<xml_diff>
--- a/Scripts order to run the code.docx
+++ b/Scripts order to run the code.docx
@@ -33,7 +33,51 @@
           <w:sz w:val="24"/>
           <w:szCs w:val="24"/>
         </w:rPr>
-        <w:t>download_census_tract (download_county_bound if need Census data at county level)</w:t>
+        <w:t>download_census_tract</w:t>
+      </w:r>
+    </w:p>
+    <w:p>
+      <w:pPr>
+        <w:rPr>
+          <w:sz w:val="24"/>
+          <w:szCs w:val="24"/>
+        </w:rPr>
+      </w:pPr>
+      <w:r>
+        <w:rPr>
+          <w:sz w:val="24"/>
+          <w:szCs w:val="24"/>
+        </w:rPr>
+        <w:t>download_county_bound</w:t>
+      </w:r>
+    </w:p>
+    <w:p>
+      <w:pPr>
+        <w:rPr>
+          <w:sz w:val="24"/>
+          <w:szCs w:val="24"/>
+        </w:rPr>
+      </w:pPr>
+      <w:r>
+        <w:rPr>
+          <w:sz w:val="24"/>
+          <w:szCs w:val="24"/>
+        </w:rPr>
+        <w:t>download_</w:t>
+      </w:r>
+      <w:r>
+        <w:rPr>
+          <w:sz w:val="24"/>
+          <w:szCs w:val="24"/>
+        </w:rPr>
+        <w:t>state</w:t>
+      </w:r>
+      <w:r>
+        <w:rPr>
+          <w:sz w:val="24"/>
+          <w:szCs w:val="24"/>
+        </w:rPr>
+        <w:t>_bound</w:t>
       </w:r>
     </w:p>
     <w:p>
@@ -51,7 +95,14 @@
           <w:sz w:val="24"/>
           <w:szCs w:val="24"/>
         </w:rPr>
-        <w:t>download_3DEP</w:t>
+        <w:t>download_</w:t>
+      </w:r>
+      <w:r>
+        <w:rPr>
+          <w:sz w:val="24"/>
+          <w:szCs w:val="24"/>
+        </w:rPr>
+        <w:t>elevation</w:t>
       </w:r>
     </w:p>
     <w:p>
@@ -69,7 +120,14 @@
           <w:sz w:val="24"/>
           <w:szCs w:val="24"/>
         </w:rPr>
-        <w:t>calculate_slope</w:t>
+        <w:t>reproject_</w:t>
+      </w:r>
+      <w:r>
+        <w:rPr>
+          <w:sz w:val="24"/>
+          <w:szCs w:val="24"/>
+        </w:rPr>
+        <w:t xml:space="preserve"> elevation</w:t>
       </w:r>
     </w:p>
     <w:p>
@@ -82,22 +140,13 @@
           <w:szCs w:val="24"/>
         </w:rPr>
       </w:pPr>
-      <w:proofErr w:type="spellStart"/>
-      <w:r>
-        <w:rPr>
-          <w:sz w:val="24"/>
-          <w:szCs w:val="24"/>
-        </w:rPr>
-        <w:t>reproject_</w:t>
-      </w:r>
-      <w:r>
-        <w:rPr>
-          <w:sz w:val="24"/>
-          <w:szCs w:val="24"/>
-        </w:rPr>
-        <w:t>slope_elevation</w:t>
-      </w:r>
-      <w:proofErr w:type="spellEnd"/>
+      <w:r>
+        <w:rPr>
+          <w:sz w:val="24"/>
+          <w:szCs w:val="24"/>
+        </w:rPr>
+        <w:t>calculate_slope</w:t>
+      </w:r>
     </w:p>
     <w:p>
       <w:pPr>
@@ -114,7 +163,7 @@
           <w:sz w:val="24"/>
           <w:szCs w:val="24"/>
         </w:rPr>
-        <w:t>download_watershed</w:t>
+        <w:t>clip_elevation_slope</w:t>
       </w:r>
     </w:p>
     <w:p>
@@ -132,7 +181,7 @@
           <w:sz w:val="24"/>
           <w:szCs w:val="24"/>
         </w:rPr>
-        <w:t>download_roads</w:t>
+        <w:t>download_watershed</w:t>
       </w:r>
     </w:p>
     <w:p>
@@ -150,7 +199,7 @@
           <w:sz w:val="24"/>
           <w:szCs w:val="24"/>
         </w:rPr>
-        <w:t>download_weather</w:t>
+        <w:t>download_roads</w:t>
       </w:r>
     </w:p>
     <w:p>
@@ -163,22 +212,13 @@
           <w:szCs w:val="24"/>
         </w:rPr>
       </w:pPr>
-      <w:proofErr w:type="spellStart"/>
-      <w:r>
-        <w:rPr>
-          <w:sz w:val="24"/>
-          <w:szCs w:val="24"/>
-        </w:rPr>
-        <w:t>clip_reproject_weather_raster</w:t>
-      </w:r>
-      <w:r>
-        <w:rPr>
-          <w:sz w:val="24"/>
-          <w:szCs w:val="24"/>
-        </w:rPr>
-        <w:t>s</w:t>
-      </w:r>
-      <w:proofErr w:type="spellEnd"/>
+      <w:r>
+        <w:rPr>
+          <w:sz w:val="24"/>
+          <w:szCs w:val="24"/>
+        </w:rPr>
+        <w:t>download_weather</w:t>
+      </w:r>
     </w:p>
     <w:p>
       <w:pPr>
@@ -190,15 +230,20 @@
           <w:szCs w:val="24"/>
         </w:rPr>
       </w:pPr>
-      <w:proofErr w:type="spellStart"/>
-      <w:r>
-        <w:rPr>
-          <w:sz w:val="24"/>
-          <w:szCs w:val="24"/>
-        </w:rPr>
-        <w:t>clean_grain_price</w:t>
-      </w:r>
-      <w:proofErr w:type="spellEnd"/>
+      <w:r>
+        <w:rPr>
+          <w:sz w:val="24"/>
+          <w:szCs w:val="24"/>
+        </w:rPr>
+        <w:t>clip_reproject_weather_raster</w:t>
+      </w:r>
+      <w:r>
+        <w:rPr>
+          <w:sz w:val="24"/>
+          <w:szCs w:val="24"/>
+        </w:rPr>
+        <w:t>s</w:t>
+      </w:r>
     </w:p>
     <w:p>
       <w:pPr>
@@ -210,6 +255,56 @@
           <w:szCs w:val="24"/>
         </w:rPr>
       </w:pPr>
+      <w:r>
+        <w:rPr>
+          <w:sz w:val="24"/>
+          <w:szCs w:val="24"/>
+        </w:rPr>
+        <w:t>clean_grain_price</w:t>
+      </w:r>
+    </w:p>
+    <w:p>
+      <w:pPr>
+        <w:tabs>
+          <w:tab w:val="left" w:pos="2192"/>
+        </w:tabs>
+        <w:rPr>
+          <w:sz w:val="24"/>
+          <w:szCs w:val="24"/>
+        </w:rPr>
+      </w:pPr>
+      <w:r>
+        <w:rPr>
+          <w:sz w:val="24"/>
+          <w:szCs w:val="24"/>
+        </w:rPr>
+        <w:t>clip_gSSURGO_</w:t>
+      </w:r>
+      <w:r>
+        <w:rPr>
+          <w:sz w:val="24"/>
+          <w:szCs w:val="24"/>
+        </w:rPr>
+        <w:t>mukey_</w:t>
+      </w:r>
+      <w:r>
+        <w:rPr>
+          <w:sz w:val="24"/>
+          <w:szCs w:val="24"/>
+        </w:rPr>
+        <w:t>rasters</w:t>
+      </w:r>
+    </w:p>
+    <w:p>
+      <w:pPr>
+        <w:tabs>
+          <w:tab w:val="left" w:pos="2192"/>
+        </w:tabs>
+        <w:rPr>
+          <w:sz w:val="24"/>
+          <w:szCs w:val="24"/>
+        </w:rPr>
+      </w:pPr>
     </w:p>
     <w:p>
       <w:pPr>
@@ -299,6 +394,51 @@
           <w:sz w:val="24"/>
           <w:szCs w:val="24"/>
         </w:rPr>
+        <w:t>join_dises_shape_table</w:t>
+      </w:r>
+    </w:p>
+    <w:p>
+      <w:pPr>
+        <w:rPr>
+          <w:sz w:val="24"/>
+          <w:szCs w:val="24"/>
+        </w:rPr>
+      </w:pPr>
+      <w:r>
+        <w:rPr>
+          <w:sz w:val="24"/>
+          <w:szCs w:val="24"/>
+        </w:rPr>
+        <w:t>join_regrow_updates</w:t>
+      </w:r>
+    </w:p>
+    <w:p>
+      <w:pPr>
+        <w:rPr>
+          <w:sz w:val="24"/>
+          <w:szCs w:val="24"/>
+        </w:rPr>
+      </w:pPr>
+      <w:r>
+        <w:rPr>
+          <w:sz w:val="24"/>
+          <w:szCs w:val="24"/>
+        </w:rPr>
+        <w:t>split_regrow_monitor_by_state</w:t>
+      </w:r>
+    </w:p>
+    <w:p>
+      <w:pPr>
+        <w:rPr>
+          <w:sz w:val="24"/>
+          <w:szCs w:val="24"/>
+        </w:rPr>
+      </w:pPr>
+      <w:r>
+        <w:rPr>
+          <w:sz w:val="24"/>
+          <w:szCs w:val="24"/>
+        </w:rPr>
         <w:t>clean_regrow_table</w:t>
       </w:r>
     </w:p>
@@ -417,6 +557,7 @@
           <w:sz w:val="24"/>
           <w:szCs w:val="24"/>
         </w:rPr>
+        <w:lastRenderedPageBreak/>
         <w:t>join_regrow_</w:t>
       </w:r>
       <w:r>
@@ -564,17 +705,39 @@
           <w:szCs w:val="24"/>
         </w:rPr>
       </w:pPr>
-    </w:p>
-    <w:p>
-      <w:pPr>
-        <w:rPr>
-          <w:sz w:val="24"/>
-          <w:szCs w:val="24"/>
-        </w:rPr>
-      </w:pPr>
-    </w:p>
-    <w:p>
-      <w:pPr>
+      <w:r>
+        <w:rPr>
+          <w:sz w:val="24"/>
+          <w:szCs w:val="24"/>
+        </w:rPr>
+        <w:t>rasterize_regrow_to_gSSURGO_grid</w:t>
+      </w:r>
+    </w:p>
+    <w:p>
+      <w:pPr>
+        <w:rPr>
+          <w:sz w:val="24"/>
+          <w:szCs w:val="24"/>
+        </w:rPr>
+      </w:pPr>
+      <w:r>
+        <w:rPr>
+          <w:sz w:val="24"/>
+          <w:szCs w:val="24"/>
+        </w:rPr>
+        <w:t>join_regrow_ supplement_</w:t>
+      </w:r>
+      <w:r>
+        <w:rPr>
+          <w:sz w:val="24"/>
+          <w:szCs w:val="24"/>
+        </w:rPr>
+        <w:t>8</w:t>
+      </w:r>
+    </w:p>
+    <w:p>
+      <w:pPr>
+        <w:spacing w:before="240"/>
         <w:rPr>
           <w:b/>
           <w:bCs/>
@@ -589,7 +752,6 @@
           <w:sz w:val="24"/>
           <w:szCs w:val="24"/>
         </w:rPr>
-        <w:lastRenderedPageBreak/>
         <w:t>Chain of scripts to run to join CSB + DISES + supplementary data</w:t>
       </w:r>
     </w:p>
@@ -635,6 +797,21 @@
           <w:sz w:val="24"/>
           <w:szCs w:val="24"/>
         </w:rPr>
+        <w:t>join_dises_shape_table</w:t>
+      </w:r>
+    </w:p>
+    <w:p>
+      <w:pPr>
+        <w:rPr>
+          <w:sz w:val="24"/>
+          <w:szCs w:val="24"/>
+        </w:rPr>
+      </w:pPr>
+      <w:r>
+        <w:rPr>
+          <w:sz w:val="24"/>
+          <w:szCs w:val="24"/>
+        </w:rPr>
         <w:t>download_csb</w:t>
       </w:r>
     </w:p>
@@ -645,7 +822,6 @@
           <w:szCs w:val="24"/>
         </w:rPr>
       </w:pPr>
-      <w:proofErr w:type="spellStart"/>
       <w:r>
         <w:rPr>
           <w:sz w:val="24"/>
@@ -653,16 +829,14 @@
         </w:rPr>
         <w:t>clip_csb_shape</w:t>
       </w:r>
-      <w:proofErr w:type="spellEnd"/>
-    </w:p>
-    <w:p>
-      <w:pPr>
-        <w:rPr>
-          <w:sz w:val="24"/>
-          <w:szCs w:val="24"/>
-        </w:rPr>
-      </w:pPr>
-      <w:proofErr w:type="spellStart"/>
+    </w:p>
+    <w:p>
+      <w:pPr>
+        <w:rPr>
+          <w:sz w:val="24"/>
+          <w:szCs w:val="24"/>
+        </w:rPr>
+      </w:pPr>
       <w:r>
         <w:rPr>
           <w:sz w:val="24"/>
@@ -670,7 +844,6 @@
         </w:rPr>
         <w:t>split_csb_shape</w:t>
       </w:r>
-      <w:proofErr w:type="spellEnd"/>
     </w:p>
     <w:p>
       <w:pPr>
@@ -888,6 +1061,57 @@
           <w:szCs w:val="24"/>
         </w:rPr>
         <w:t>7</w:t>
+      </w:r>
+    </w:p>
+    <w:p>
+      <w:pPr>
+        <w:rPr>
+          <w:sz w:val="24"/>
+          <w:szCs w:val="24"/>
+        </w:rPr>
+      </w:pPr>
+      <w:r>
+        <w:rPr>
+          <w:sz w:val="24"/>
+          <w:szCs w:val="24"/>
+        </w:rPr>
+        <w:t>rasterize_</w:t>
+      </w:r>
+      <w:r>
+        <w:rPr>
+          <w:sz w:val="24"/>
+          <w:szCs w:val="24"/>
+        </w:rPr>
+        <w:t>CSB</w:t>
+      </w:r>
+      <w:r>
+        <w:rPr>
+          <w:sz w:val="24"/>
+          <w:szCs w:val="24"/>
+        </w:rPr>
+        <w:t>_to_gSSURGO_grid</w:t>
+      </w:r>
+    </w:p>
+    <w:p>
+      <w:pPr>
+        <w:rPr>
+          <w:sz w:val="24"/>
+          <w:szCs w:val="24"/>
+        </w:rPr>
+      </w:pPr>
+      <w:r>
+        <w:rPr>
+          <w:sz w:val="24"/>
+          <w:szCs w:val="24"/>
+        </w:rPr>
+        <w:t>join_csb_ supplement_</w:t>
+      </w:r>
+      <w:r>
+        <w:rPr>
+          <w:sz w:val="24"/>
+          <w:szCs w:val="24"/>
+        </w:rPr>
+        <w:t>8</w:t>
       </w:r>
     </w:p>
     <w:p>
@@ -967,22 +1191,6 @@
         </w:rPr>
         <w:t>convert_csv_to_parquet</w:t>
       </w:r>
-    </w:p>
-    <w:p>
-      <w:pPr>
-        <w:rPr>
-          <w:sz w:val="24"/>
-          <w:szCs w:val="24"/>
-        </w:rPr>
-      </w:pPr>
-    </w:p>
-    <w:p>
-      <w:pPr>
-        <w:rPr>
-          <w:sz w:val="24"/>
-          <w:szCs w:val="24"/>
-        </w:rPr>
-      </w:pPr>
     </w:p>
     <w:sectPr>
       <w:pgSz w:w="12240" w:h="15840"/>

</xml_diff>

<commit_message>
Changes to dises processing and dises merging; cnahges to the documentation
</commit_message>
<xml_diff>
--- a/Scripts order to run the code.docx
+++ b/Scripts order to run the code.docx
@@ -1,6 +1,6 @@
 
 <file path=word/document.xml><?xml version="1.0" encoding="utf-8"?>
-<w:document xmlns:wpc="http://schemas.microsoft.com/office/word/2010/wordprocessingCanvas" xmlns:cx="http://schemas.microsoft.com/office/drawing/2014/chartex" xmlns:cx1="http://schemas.microsoft.com/office/drawing/2015/9/8/chartex" xmlns:cx2="http://schemas.microsoft.com/office/drawing/2015/10/21/chartex" xmlns:cx3="http://schemas.microsoft.com/office/drawing/2016/5/9/chartex" xmlns:cx4="http://schemas.microsoft.com/office/drawing/2016/5/10/chartex" xmlns:cx5="http://schemas.microsoft.com/office/drawing/2016/5/11/chartex" xmlns:cx6="http://schemas.microsoft.com/office/drawing/2016/5/12/chartex" xmlns:cx7="http://schemas.microsoft.com/office/drawing/2016/5/13/chartex" xmlns:cx8="http://schemas.microsoft.com/office/drawing/2016/5/14/chartex" xmlns:mc="http://schemas.openxmlformats.org/markup-compatibility/2006" xmlns:aink="http://schemas.microsoft.com/office/drawing/2016/ink" xmlns:am3d="http://schemas.microsoft.com/office/drawing/2017/model3d" xmlns:o="urn:schemas-microsoft-com:office:office" xmlns:r="http://schemas.openxmlformats.org/officeDocument/2006/relationships" xmlns:m="http://schemas.openxmlformats.org/officeDocument/2006/math" xmlns:v="urn:schemas-microsoft-com:vml" xmlns:wp14="http://schemas.microsoft.com/office/word/2010/wordprocessingDrawing" xmlns:wp="http://schemas.openxmlformats.org/drawingml/2006/wordprocessingDrawing" xmlns:w10="urn:schemas-microsoft-com:office:word" xmlns:w="http://schemas.openxmlformats.org/wordprocessingml/2006/main" xmlns:w14="http://schemas.microsoft.com/office/word/2010/wordml" xmlns:w15="http://schemas.microsoft.com/office/word/2012/wordml" xmlns:w16cex="http://schemas.microsoft.com/office/word/2018/wordml/cex" xmlns:w16cid="http://schemas.microsoft.com/office/word/2016/wordml/cid" xmlns:w16="http://schemas.microsoft.com/office/word/2018/wordml" xmlns:w16sdtdh="http://schemas.microsoft.com/office/word/2020/wordml/sdtdatahash" xmlns:w16se="http://schemas.microsoft.com/office/word/2015/wordml/symex" xmlns:wpg="http://schemas.microsoft.com/office/word/2010/wordprocessingGroup" xmlns:wpi="http://schemas.microsoft.com/office/word/2010/wordprocessingInk" xmlns:wne="http://schemas.microsoft.com/office/word/2006/wordml" xmlns:wps="http://schemas.microsoft.com/office/word/2010/wordprocessingShape" mc:Ignorable="w14 w15 w16se w16cid w16 w16cex w16sdtdh wp14">
+<w:document xmlns:wpc="http://schemas.microsoft.com/office/word/2010/wordprocessingCanvas" xmlns:cx="http://schemas.microsoft.com/office/drawing/2014/chartex" xmlns:cx1="http://schemas.microsoft.com/office/drawing/2015/9/8/chartex" xmlns:cx2="http://schemas.microsoft.com/office/drawing/2015/10/21/chartex" xmlns:cx3="http://schemas.microsoft.com/office/drawing/2016/5/9/chartex" xmlns:cx4="http://schemas.microsoft.com/office/drawing/2016/5/10/chartex" xmlns:cx5="http://schemas.microsoft.com/office/drawing/2016/5/11/chartex" xmlns:cx6="http://schemas.microsoft.com/office/drawing/2016/5/12/chartex" xmlns:cx7="http://schemas.microsoft.com/office/drawing/2016/5/13/chartex" xmlns:cx8="http://schemas.microsoft.com/office/drawing/2016/5/14/chartex" xmlns:mc="http://schemas.openxmlformats.org/markup-compatibility/2006" xmlns:aink="http://schemas.microsoft.com/office/drawing/2016/ink" xmlns:am3d="http://schemas.microsoft.com/office/drawing/2017/model3d" xmlns:o="urn:schemas-microsoft-com:office:office" xmlns:oel="http://schemas.microsoft.com/office/2019/extlst" xmlns:r="http://schemas.openxmlformats.org/officeDocument/2006/relationships" xmlns:m="http://schemas.openxmlformats.org/officeDocument/2006/math" xmlns:v="urn:schemas-microsoft-com:vml" xmlns:wp14="http://schemas.microsoft.com/office/word/2010/wordprocessingDrawing" xmlns:wp="http://schemas.openxmlformats.org/drawingml/2006/wordprocessingDrawing" xmlns:w10="urn:schemas-microsoft-com:office:word" xmlns:w="http://schemas.openxmlformats.org/wordprocessingml/2006/main" xmlns:w14="http://schemas.microsoft.com/office/word/2010/wordml" xmlns:w15="http://schemas.microsoft.com/office/word/2012/wordml" xmlns:w16cex="http://schemas.microsoft.com/office/word/2018/wordml/cex" xmlns:w16cid="http://schemas.microsoft.com/office/word/2016/wordml/cid" xmlns:w16="http://schemas.microsoft.com/office/word/2018/wordml" xmlns:w16du="http://schemas.microsoft.com/office/word/2023/wordml/word16du" xmlns:w16sdtdh="http://schemas.microsoft.com/office/word/2020/wordml/sdtdatahash" xmlns:w16sdtfl="http://schemas.microsoft.com/office/word/2024/wordml/sdtformatlock" xmlns:w16se="http://schemas.microsoft.com/office/word/2015/wordml/symex" xmlns:wpg="http://schemas.microsoft.com/office/word/2010/wordprocessingGroup" xmlns:wpi="http://schemas.microsoft.com/office/word/2010/wordprocessingInk" xmlns:wne="http://schemas.microsoft.com/office/word/2006/wordml" xmlns:wps="http://schemas.microsoft.com/office/word/2010/wordprocessingShape" mc:Ignorable="w14 w15 w16se w16cid w16 w16cex w16sdtdh w16sdtfl w16du wp14">
   <w:body>
     <w:p>
       <w:pPr>
@@ -28,7 +28,6 @@
           <w:szCs w:val="24"/>
         </w:rPr>
       </w:pPr>
-      <w:proofErr w:type="spellStart"/>
       <w:r>
         <w:rPr>
           <w:sz w:val="24"/>
@@ -36,16 +35,14 @@
         </w:rPr>
         <w:t>download_census_tract</w:t>
       </w:r>
-      <w:proofErr w:type="spellEnd"/>
-    </w:p>
-    <w:p>
-      <w:pPr>
-        <w:rPr>
-          <w:sz w:val="24"/>
-          <w:szCs w:val="24"/>
-        </w:rPr>
-      </w:pPr>
-      <w:proofErr w:type="spellStart"/>
+    </w:p>
+    <w:p>
+      <w:pPr>
+        <w:rPr>
+          <w:sz w:val="24"/>
+          <w:szCs w:val="24"/>
+        </w:rPr>
+      </w:pPr>
       <w:r>
         <w:rPr>
           <w:sz w:val="24"/>
@@ -53,16 +50,14 @@
         </w:rPr>
         <w:t>download_county_bound</w:t>
       </w:r>
-      <w:proofErr w:type="spellEnd"/>
-    </w:p>
-    <w:p>
-      <w:pPr>
-        <w:rPr>
-          <w:sz w:val="24"/>
-          <w:szCs w:val="24"/>
-        </w:rPr>
-      </w:pPr>
-      <w:proofErr w:type="spellStart"/>
+    </w:p>
+    <w:p>
+      <w:pPr>
+        <w:rPr>
+          <w:sz w:val="24"/>
+          <w:szCs w:val="24"/>
+        </w:rPr>
+      </w:pPr>
       <w:r>
         <w:rPr>
           <w:sz w:val="24"/>
@@ -84,7 +79,6 @@
         </w:rPr>
         <w:t>_bound</w:t>
       </w:r>
-      <w:proofErr w:type="spellEnd"/>
     </w:p>
     <w:p>
       <w:pPr>
@@ -96,7 +90,6 @@
           <w:szCs w:val="24"/>
         </w:rPr>
       </w:pPr>
-      <w:proofErr w:type="spellStart"/>
       <w:r>
         <w:rPr>
           <w:sz w:val="24"/>
@@ -111,7 +104,6 @@
         </w:rPr>
         <w:t>elevation</w:t>
       </w:r>
-      <w:proofErr w:type="spellEnd"/>
     </w:p>
     <w:p>
       <w:pPr>
@@ -123,7 +115,6 @@
           <w:szCs w:val="24"/>
         </w:rPr>
       </w:pPr>
-      <w:proofErr w:type="spellStart"/>
       <w:r>
         <w:rPr>
           <w:sz w:val="24"/>
@@ -138,7 +129,6 @@
         </w:rPr>
         <w:t>elevation</w:t>
       </w:r>
-      <w:proofErr w:type="spellEnd"/>
     </w:p>
     <w:p>
       <w:pPr>
@@ -150,7 +140,6 @@
           <w:szCs w:val="24"/>
         </w:rPr>
       </w:pPr>
-      <w:proofErr w:type="spellStart"/>
       <w:r>
         <w:rPr>
           <w:sz w:val="24"/>
@@ -158,7 +147,6 @@
         </w:rPr>
         <w:t>calculate_slope</w:t>
       </w:r>
-      <w:proofErr w:type="spellEnd"/>
     </w:p>
     <w:p>
       <w:pPr>
@@ -170,7 +158,6 @@
           <w:szCs w:val="24"/>
         </w:rPr>
       </w:pPr>
-      <w:proofErr w:type="spellStart"/>
       <w:r>
         <w:rPr>
           <w:sz w:val="24"/>
@@ -178,7 +165,6 @@
         </w:rPr>
         <w:t>clip_elevation_slope</w:t>
       </w:r>
-      <w:proofErr w:type="spellEnd"/>
     </w:p>
     <w:p>
       <w:pPr>
@@ -190,7 +176,6 @@
           <w:szCs w:val="24"/>
         </w:rPr>
       </w:pPr>
-      <w:proofErr w:type="spellStart"/>
       <w:r>
         <w:rPr>
           <w:sz w:val="24"/>
@@ -198,7 +183,6 @@
         </w:rPr>
         <w:t>download_watershed</w:t>
       </w:r>
-      <w:proofErr w:type="spellEnd"/>
     </w:p>
     <w:p>
       <w:pPr>
@@ -210,7 +194,6 @@
           <w:szCs w:val="24"/>
         </w:rPr>
       </w:pPr>
-      <w:proofErr w:type="spellStart"/>
       <w:r>
         <w:rPr>
           <w:sz w:val="24"/>
@@ -218,7 +201,6 @@
         </w:rPr>
         <w:t>download_roads</w:t>
       </w:r>
-      <w:proofErr w:type="spellEnd"/>
     </w:p>
     <w:p>
       <w:pPr>
@@ -230,7 +212,6 @@
           <w:szCs w:val="24"/>
         </w:rPr>
       </w:pPr>
-      <w:proofErr w:type="spellStart"/>
       <w:r>
         <w:rPr>
           <w:sz w:val="24"/>
@@ -238,7 +219,6 @@
         </w:rPr>
         <w:t>download_weather</w:t>
       </w:r>
-      <w:proofErr w:type="spellEnd"/>
     </w:p>
     <w:p>
       <w:pPr>
@@ -250,7 +230,6 @@
           <w:szCs w:val="24"/>
         </w:rPr>
       </w:pPr>
-      <w:proofErr w:type="spellStart"/>
       <w:r>
         <w:rPr>
           <w:sz w:val="24"/>
@@ -265,7 +244,6 @@
         </w:rPr>
         <w:t>s</w:t>
       </w:r>
-      <w:proofErr w:type="spellEnd"/>
     </w:p>
     <w:p>
       <w:pPr>
@@ -277,15 +255,20 @@
           <w:szCs w:val="24"/>
         </w:rPr>
       </w:pPr>
-      <w:proofErr w:type="spellStart"/>
-      <w:r>
-        <w:rPr>
-          <w:sz w:val="24"/>
-          <w:szCs w:val="24"/>
-        </w:rPr>
-        <w:t>clean_grain_price</w:t>
-      </w:r>
-      <w:proofErr w:type="spellEnd"/>
+      <w:r>
+        <w:rPr>
+          <w:sz w:val="24"/>
+          <w:szCs w:val="24"/>
+        </w:rPr>
+        <w:t>clean_</w:t>
+      </w:r>
+      <w:r>
+        <w:rPr>
+          <w:sz w:val="24"/>
+          <w:szCs w:val="24"/>
+        </w:rPr>
+        <w:t>crop_prices</w:t>
+      </w:r>
     </w:p>
     <w:p>
       <w:pPr>
@@ -297,7 +280,6 @@
           <w:szCs w:val="24"/>
         </w:rPr>
       </w:pPr>
-      <w:proofErr w:type="spellStart"/>
       <w:r>
         <w:rPr>
           <w:sz w:val="24"/>
@@ -319,7 +301,6 @@
         </w:rPr>
         <w:t>rasters</w:t>
       </w:r>
-      <w:proofErr w:type="spellEnd"/>
     </w:p>
     <w:p>
       <w:pPr>
@@ -367,7 +348,6 @@
           <w:szCs w:val="24"/>
         </w:rPr>
       </w:pPr>
-      <w:proofErr w:type="spellStart"/>
       <w:r>
         <w:rPr>
           <w:sz w:val="24"/>
@@ -375,16 +355,14 @@
         </w:rPr>
         <w:t>clean_dises_table</w:t>
       </w:r>
-      <w:proofErr w:type="spellEnd"/>
-    </w:p>
-    <w:p>
-      <w:pPr>
-        <w:rPr>
-          <w:sz w:val="24"/>
-          <w:szCs w:val="24"/>
-        </w:rPr>
-      </w:pPr>
-      <w:proofErr w:type="spellStart"/>
+    </w:p>
+    <w:p>
+      <w:pPr>
+        <w:rPr>
+          <w:sz w:val="24"/>
+          <w:szCs w:val="24"/>
+        </w:rPr>
+      </w:pPr>
       <w:r>
         <w:rPr>
           <w:sz w:val="24"/>
@@ -392,16 +370,14 @@
         </w:rPr>
         <w:t>clean_dises_shape</w:t>
       </w:r>
-      <w:proofErr w:type="spellEnd"/>
-    </w:p>
-    <w:p>
-      <w:pPr>
-        <w:rPr>
-          <w:sz w:val="24"/>
-          <w:szCs w:val="24"/>
-        </w:rPr>
-      </w:pPr>
-      <w:proofErr w:type="spellStart"/>
+    </w:p>
+    <w:p>
+      <w:pPr>
+        <w:rPr>
+          <w:sz w:val="24"/>
+          <w:szCs w:val="24"/>
+        </w:rPr>
+      </w:pPr>
       <w:r>
         <w:rPr>
           <w:sz w:val="24"/>
@@ -409,7 +385,6 @@
         </w:rPr>
         <w:t>join_dises_shape_table</w:t>
       </w:r>
-      <w:proofErr w:type="spellEnd"/>
     </w:p>
     <w:p>
       <w:pPr>
@@ -469,7 +444,6 @@
           <w:szCs w:val="24"/>
         </w:rPr>
       </w:pPr>
-      <w:proofErr w:type="spellStart"/>
       <w:r>
         <w:rPr>
           <w:sz w:val="24"/>
@@ -477,16 +451,14 @@
         </w:rPr>
         <w:t>split_save_regrow_geometry</w:t>
       </w:r>
-      <w:proofErr w:type="spellEnd"/>
-    </w:p>
-    <w:p>
-      <w:pPr>
-        <w:rPr>
-          <w:sz w:val="24"/>
-          <w:szCs w:val="24"/>
-        </w:rPr>
-      </w:pPr>
-      <w:proofErr w:type="spellStart"/>
+    </w:p>
+    <w:p>
+      <w:pPr>
+        <w:rPr>
+          <w:sz w:val="24"/>
+          <w:szCs w:val="24"/>
+        </w:rPr>
+      </w:pPr>
       <w:r>
         <w:rPr>
           <w:sz w:val="24"/>
@@ -494,16 +466,14 @@
         </w:rPr>
         <w:t>split_regrow_monitor_by_state</w:t>
       </w:r>
-      <w:proofErr w:type="spellEnd"/>
-    </w:p>
-    <w:p>
-      <w:pPr>
-        <w:rPr>
-          <w:sz w:val="24"/>
-          <w:szCs w:val="24"/>
-        </w:rPr>
-      </w:pPr>
-      <w:proofErr w:type="spellStart"/>
+    </w:p>
+    <w:p>
+      <w:pPr>
+        <w:rPr>
+          <w:sz w:val="24"/>
+          <w:szCs w:val="24"/>
+        </w:rPr>
+      </w:pPr>
       <w:r>
         <w:rPr>
           <w:sz w:val="24"/>
@@ -511,16 +481,14 @@
         </w:rPr>
         <w:t>clean_regrow_table</w:t>
       </w:r>
-      <w:proofErr w:type="spellEnd"/>
-    </w:p>
-    <w:p>
-      <w:pPr>
-        <w:rPr>
-          <w:sz w:val="24"/>
-          <w:szCs w:val="24"/>
-        </w:rPr>
-      </w:pPr>
-      <w:proofErr w:type="spellStart"/>
+    </w:p>
+    <w:p>
+      <w:pPr>
+        <w:rPr>
+          <w:sz w:val="24"/>
+          <w:szCs w:val="24"/>
+        </w:rPr>
+      </w:pPr>
       <w:r>
         <w:rPr>
           <w:sz w:val="24"/>
@@ -528,16 +496,14 @@
         </w:rPr>
         <w:t>join_regrow_shape_table</w:t>
       </w:r>
-      <w:proofErr w:type="spellEnd"/>
-    </w:p>
-    <w:p>
-      <w:pPr>
-        <w:rPr>
-          <w:sz w:val="24"/>
-          <w:szCs w:val="24"/>
-        </w:rPr>
-      </w:pPr>
-      <w:proofErr w:type="spellStart"/>
+    </w:p>
+    <w:p>
+      <w:pPr>
+        <w:rPr>
+          <w:sz w:val="24"/>
+          <w:szCs w:val="24"/>
+        </w:rPr>
+      </w:pPr>
       <w:r>
         <w:rPr>
           <w:sz w:val="24"/>
@@ -545,16 +511,14 @@
         </w:rPr>
         <w:t>check_regrow_shape_table</w:t>
       </w:r>
-      <w:proofErr w:type="spellEnd"/>
-    </w:p>
-    <w:p>
-      <w:pPr>
-        <w:rPr>
-          <w:sz w:val="24"/>
-          <w:szCs w:val="24"/>
-        </w:rPr>
-      </w:pPr>
-      <w:proofErr w:type="spellStart"/>
+    </w:p>
+    <w:p>
+      <w:pPr>
+        <w:rPr>
+          <w:sz w:val="24"/>
+          <w:szCs w:val="24"/>
+        </w:rPr>
+      </w:pPr>
       <w:r>
         <w:rPr>
           <w:sz w:val="24"/>
@@ -563,7 +527,6 @@
         <w:lastRenderedPageBreak/>
         <w:t>rasterize_regrow_to_gSSURGO_grid</w:t>
       </w:r>
-      <w:proofErr w:type="spellEnd"/>
     </w:p>
     <w:p>
       <w:pPr>
@@ -628,7 +591,6 @@
           <w:szCs w:val="24"/>
         </w:rPr>
       </w:pPr>
-      <w:proofErr w:type="spellStart"/>
       <w:r>
         <w:rPr>
           <w:sz w:val="24"/>
@@ -636,16 +598,14 @@
         </w:rPr>
         <w:t>join_regrow_dises</w:t>
       </w:r>
-      <w:proofErr w:type="spellEnd"/>
-    </w:p>
-    <w:p>
-      <w:pPr>
-        <w:rPr>
-          <w:sz w:val="24"/>
-          <w:szCs w:val="24"/>
-        </w:rPr>
-      </w:pPr>
-      <w:proofErr w:type="spellStart"/>
+    </w:p>
+    <w:p>
+      <w:pPr>
+        <w:rPr>
+          <w:sz w:val="24"/>
+          <w:szCs w:val="24"/>
+        </w:rPr>
+      </w:pPr>
       <w:r>
         <w:rPr>
           <w:sz w:val="24"/>
@@ -660,16 +620,14 @@
         </w:rPr>
         <w:t>census_tract</w:t>
       </w:r>
-      <w:proofErr w:type="spellEnd"/>
-    </w:p>
-    <w:p>
-      <w:pPr>
-        <w:rPr>
-          <w:sz w:val="24"/>
-          <w:szCs w:val="24"/>
-        </w:rPr>
-      </w:pPr>
-      <w:proofErr w:type="spellStart"/>
+    </w:p>
+    <w:p>
+      <w:pPr>
+        <w:rPr>
+          <w:sz w:val="24"/>
+          <w:szCs w:val="24"/>
+        </w:rPr>
+      </w:pPr>
       <w:r>
         <w:rPr>
           <w:sz w:val="24"/>
@@ -684,16 +642,14 @@
         </w:rPr>
         <w:t>elevation_slope</w:t>
       </w:r>
-      <w:proofErr w:type="spellEnd"/>
-    </w:p>
-    <w:p>
-      <w:pPr>
-        <w:rPr>
-          <w:sz w:val="24"/>
-          <w:szCs w:val="24"/>
-        </w:rPr>
-      </w:pPr>
-      <w:proofErr w:type="spellStart"/>
+    </w:p>
+    <w:p>
+      <w:pPr>
+        <w:rPr>
+          <w:sz w:val="24"/>
+          <w:szCs w:val="24"/>
+        </w:rPr>
+      </w:pPr>
       <w:r>
         <w:rPr>
           <w:sz w:val="24"/>
@@ -708,16 +664,14 @@
         </w:rPr>
         <w:t>watershed</w:t>
       </w:r>
-      <w:proofErr w:type="spellEnd"/>
-    </w:p>
-    <w:p>
-      <w:pPr>
-        <w:rPr>
-          <w:sz w:val="24"/>
-          <w:szCs w:val="24"/>
-        </w:rPr>
-      </w:pPr>
-      <w:proofErr w:type="spellStart"/>
+    </w:p>
+    <w:p>
+      <w:pPr>
+        <w:rPr>
+          <w:sz w:val="24"/>
+          <w:szCs w:val="24"/>
+        </w:rPr>
+      </w:pPr>
       <w:r>
         <w:rPr>
           <w:sz w:val="24"/>
@@ -739,16 +693,14 @@
         </w:rPr>
         <w:t>nearest_roads</w:t>
       </w:r>
-      <w:proofErr w:type="spellEnd"/>
-    </w:p>
-    <w:p>
-      <w:pPr>
-        <w:rPr>
-          <w:sz w:val="24"/>
-          <w:szCs w:val="24"/>
-        </w:rPr>
-      </w:pPr>
-      <w:proofErr w:type="spellStart"/>
+    </w:p>
+    <w:p>
+      <w:pPr>
+        <w:rPr>
+          <w:sz w:val="24"/>
+          <w:szCs w:val="24"/>
+        </w:rPr>
+      </w:pPr>
       <w:r>
         <w:rPr>
           <w:sz w:val="24"/>
@@ -770,16 +722,14 @@
         </w:rPr>
         <w:t>neighbor_field_mgmt</w:t>
       </w:r>
-      <w:proofErr w:type="spellEnd"/>
-    </w:p>
-    <w:p>
-      <w:pPr>
-        <w:rPr>
-          <w:sz w:val="24"/>
-          <w:szCs w:val="24"/>
-        </w:rPr>
-      </w:pPr>
-      <w:proofErr w:type="spellStart"/>
+    </w:p>
+    <w:p>
+      <w:pPr>
+        <w:rPr>
+          <w:sz w:val="24"/>
+          <w:szCs w:val="24"/>
+        </w:rPr>
+      </w:pPr>
       <w:r>
         <w:rPr>
           <w:sz w:val="24"/>
@@ -801,16 +751,14 @@
         </w:rPr>
         <w:t>weather</w:t>
       </w:r>
-      <w:proofErr w:type="spellEnd"/>
-    </w:p>
-    <w:p>
-      <w:pPr>
-        <w:rPr>
-          <w:sz w:val="24"/>
-          <w:szCs w:val="24"/>
-        </w:rPr>
-      </w:pPr>
-      <w:proofErr w:type="spellStart"/>
+    </w:p>
+    <w:p>
+      <w:pPr>
+        <w:rPr>
+          <w:sz w:val="24"/>
+          <w:szCs w:val="24"/>
+        </w:rPr>
+      </w:pPr>
       <w:r>
         <w:rPr>
           <w:sz w:val="24"/>
@@ -839,16 +787,14 @@
         </w:rPr>
         <w:t>s</w:t>
       </w:r>
-      <w:proofErr w:type="spellEnd"/>
-    </w:p>
-    <w:p>
-      <w:pPr>
-        <w:rPr>
-          <w:sz w:val="24"/>
-          <w:szCs w:val="24"/>
-        </w:rPr>
-      </w:pPr>
-      <w:proofErr w:type="spellStart"/>
+    </w:p>
+    <w:p>
+      <w:pPr>
+        <w:rPr>
+          <w:sz w:val="24"/>
+          <w:szCs w:val="24"/>
+        </w:rPr>
+      </w:pPr>
       <w:r>
         <w:rPr>
           <w:sz w:val="24"/>
@@ -861,6 +807,255 @@
           <w:sz w:val="24"/>
           <w:szCs w:val="24"/>
         </w:rPr>
+        <w:t>_crop_price</w:t>
+      </w:r>
+      <w:r>
+        <w:rPr>
+          <w:sz w:val="24"/>
+          <w:szCs w:val="24"/>
+        </w:rPr>
+        <w:t>s</w:t>
+      </w:r>
+    </w:p>
+    <w:p>
+      <w:pPr>
+        <w:rPr>
+          <w:sz w:val="24"/>
+          <w:szCs w:val="24"/>
+        </w:rPr>
+      </w:pPr>
+      <w:r>
+        <w:rPr>
+          <w:sz w:val="24"/>
+          <w:szCs w:val="24"/>
+        </w:rPr>
+        <w:t>join_regrow</w:t>
+      </w:r>
+      <w:r>
+        <w:rPr>
+          <w:sz w:val="24"/>
+          <w:szCs w:val="24"/>
+        </w:rPr>
+        <w:t>_soil_composition</w:t>
+      </w:r>
+    </w:p>
+    <w:p>
+      <w:pPr>
+        <w:rPr>
+          <w:sz w:val="24"/>
+          <w:szCs w:val="24"/>
+        </w:rPr>
+      </w:pPr>
+      <w:r>
+        <w:rPr>
+          <w:sz w:val="24"/>
+          <w:szCs w:val="24"/>
+        </w:rPr>
+        <w:t>join_regrow_ag_census</w:t>
+      </w:r>
+    </w:p>
+    <w:p>
+      <w:pPr>
+        <w:rPr>
+          <w:sz w:val="24"/>
+          <w:szCs w:val="24"/>
+        </w:rPr>
+      </w:pPr>
+    </w:p>
+    <w:p>
+      <w:pPr>
+        <w:rPr>
+          <w:b/>
+          <w:bCs/>
+          <w:sz w:val="24"/>
+          <w:szCs w:val="24"/>
+        </w:rPr>
+      </w:pPr>
+      <w:r>
+        <w:rPr>
+          <w:b/>
+          <w:bCs/>
+          <w:sz w:val="24"/>
+          <w:szCs w:val="24"/>
+        </w:rPr>
+        <w:t xml:space="preserve">Chain of scripts to run to prepare </w:t>
+      </w:r>
+      <w:r>
+        <w:rPr>
+          <w:b/>
+          <w:bCs/>
+          <w:sz w:val="24"/>
+          <w:szCs w:val="24"/>
+        </w:rPr>
+        <w:t>CSB data</w:t>
+      </w:r>
+    </w:p>
+    <w:p>
+      <w:pPr>
+        <w:rPr>
+          <w:sz w:val="24"/>
+          <w:szCs w:val="24"/>
+        </w:rPr>
+      </w:pPr>
+      <w:r>
+        <w:rPr>
+          <w:sz w:val="24"/>
+          <w:szCs w:val="24"/>
+        </w:rPr>
+        <w:t>download_csb</w:t>
+      </w:r>
+    </w:p>
+    <w:p>
+      <w:pPr>
+        <w:rPr>
+          <w:sz w:val="24"/>
+          <w:szCs w:val="24"/>
+        </w:rPr>
+      </w:pPr>
+      <w:r>
+        <w:rPr>
+          <w:sz w:val="24"/>
+          <w:szCs w:val="24"/>
+        </w:rPr>
+        <w:t>clip_csb_shape</w:t>
+      </w:r>
+    </w:p>
+    <w:p>
+      <w:pPr>
+        <w:rPr>
+          <w:sz w:val="24"/>
+          <w:szCs w:val="24"/>
+        </w:rPr>
+      </w:pPr>
+      <w:r>
+        <w:rPr>
+          <w:sz w:val="24"/>
+          <w:szCs w:val="24"/>
+        </w:rPr>
+        <w:t>split_csb_shape</w:t>
+      </w:r>
+      <w:r>
+        <w:rPr>
+          <w:sz w:val="24"/>
+          <w:szCs w:val="24"/>
+        </w:rPr>
+        <w:t>_table</w:t>
+      </w:r>
+    </w:p>
+    <w:p>
+      <w:pPr>
+        <w:rPr>
+          <w:sz w:val="24"/>
+          <w:szCs w:val="24"/>
+        </w:rPr>
+      </w:pPr>
+      <w:r>
+        <w:rPr>
+          <w:sz w:val="24"/>
+          <w:szCs w:val="24"/>
+        </w:rPr>
+        <w:t>check_csb_shape_table</w:t>
+      </w:r>
+    </w:p>
+    <w:p>
+      <w:pPr>
+        <w:rPr>
+          <w:sz w:val="24"/>
+          <w:szCs w:val="24"/>
+        </w:rPr>
+      </w:pPr>
+      <w:r>
+        <w:rPr>
+          <w:sz w:val="24"/>
+          <w:szCs w:val="24"/>
+        </w:rPr>
+        <w:t>rasterize_CSB_to_gSSURGO_grid</w:t>
+      </w:r>
+    </w:p>
+    <w:p>
+      <w:pPr>
+        <w:rPr>
+          <w:sz w:val="24"/>
+          <w:szCs w:val="24"/>
+        </w:rPr>
+      </w:pPr>
+    </w:p>
+    <w:p>
+      <w:pPr>
+        <w:spacing w:before="240"/>
+        <w:rPr>
+          <w:b/>
+          <w:bCs/>
+          <w:sz w:val="24"/>
+          <w:szCs w:val="24"/>
+        </w:rPr>
+      </w:pPr>
+      <w:r>
+        <w:rPr>
+          <w:b/>
+          <w:bCs/>
+          <w:sz w:val="24"/>
+          <w:szCs w:val="24"/>
+        </w:rPr>
+        <w:t>Chain of scripts to run to join CSB + DISES + supplementary data</w:t>
+      </w:r>
+    </w:p>
+    <w:p>
+      <w:pPr>
+        <w:rPr>
+          <w:sz w:val="24"/>
+          <w:szCs w:val="24"/>
+        </w:rPr>
+      </w:pPr>
+      <w:r>
+        <w:rPr>
+          <w:sz w:val="24"/>
+          <w:szCs w:val="24"/>
+        </w:rPr>
+        <w:t>join_csb_dises</w:t>
+      </w:r>
+    </w:p>
+    <w:p>
+      <w:pPr>
+        <w:rPr>
+          <w:sz w:val="24"/>
+          <w:szCs w:val="24"/>
+        </w:rPr>
+      </w:pPr>
+      <w:r>
+        <w:rPr>
+          <w:sz w:val="24"/>
+          <w:szCs w:val="24"/>
+        </w:rPr>
+        <w:t>join_csb</w:t>
+      </w:r>
+      <w:r>
+        <w:rPr>
+          <w:sz w:val="24"/>
+          <w:szCs w:val="24"/>
+        </w:rPr>
+        <w:t>_census_tract</w:t>
+      </w:r>
+    </w:p>
+    <w:p>
+      <w:pPr>
+        <w:rPr>
+          <w:sz w:val="24"/>
+          <w:szCs w:val="24"/>
+        </w:rPr>
+      </w:pPr>
+      <w:r>
+        <w:rPr>
+          <w:sz w:val="24"/>
+          <w:szCs w:val="24"/>
+        </w:rPr>
+        <w:t>join_csb</w:t>
+      </w:r>
+      <w:r>
+        <w:rPr>
+          <w:sz w:val="24"/>
+          <w:szCs w:val="24"/>
+        </w:rPr>
         <w:t>_</w:t>
       </w:r>
       <w:r>
@@ -868,239 +1063,16 @@
           <w:sz w:val="24"/>
           <w:szCs w:val="24"/>
         </w:rPr>
-        <w:t>crop_price</w:t>
-      </w:r>
-      <w:r>
-        <w:rPr>
-          <w:sz w:val="24"/>
-          <w:szCs w:val="24"/>
-        </w:rPr>
-        <w:t>s</w:t>
-      </w:r>
-      <w:proofErr w:type="spellEnd"/>
-    </w:p>
-    <w:p>
-      <w:pPr>
-        <w:rPr>
-          <w:sz w:val="24"/>
-          <w:szCs w:val="24"/>
-        </w:rPr>
-      </w:pPr>
-      <w:proofErr w:type="spellStart"/>
-      <w:r>
-        <w:rPr>
-          <w:sz w:val="24"/>
-          <w:szCs w:val="24"/>
-        </w:rPr>
-        <w:t>join_regrow</w:t>
-      </w:r>
-      <w:r>
-        <w:rPr>
-          <w:sz w:val="24"/>
-          <w:szCs w:val="24"/>
-        </w:rPr>
-        <w:t>_soil_composition</w:t>
-      </w:r>
-      <w:proofErr w:type="spellEnd"/>
-    </w:p>
-    <w:p>
-      <w:pPr>
-        <w:rPr>
-          <w:sz w:val="24"/>
-          <w:szCs w:val="24"/>
-        </w:rPr>
-      </w:pPr>
-      <w:proofErr w:type="spellStart"/>
-      <w:r>
-        <w:rPr>
-          <w:sz w:val="24"/>
-          <w:szCs w:val="24"/>
-        </w:rPr>
-        <w:t>join_regrow_ag_census</w:t>
-      </w:r>
-      <w:proofErr w:type="spellEnd"/>
-    </w:p>
-    <w:p>
-      <w:pPr>
-        <w:rPr>
-          <w:sz w:val="24"/>
-          <w:szCs w:val="24"/>
-        </w:rPr>
-      </w:pPr>
-    </w:p>
-    <w:p>
-      <w:pPr>
-        <w:rPr>
-          <w:b/>
-          <w:bCs/>
-          <w:sz w:val="24"/>
-          <w:szCs w:val="24"/>
-        </w:rPr>
-      </w:pPr>
-      <w:r>
-        <w:rPr>
-          <w:b/>
-          <w:bCs/>
-          <w:sz w:val="24"/>
-          <w:szCs w:val="24"/>
-        </w:rPr>
-        <w:t xml:space="preserve">Chain of scripts to run to prepare </w:t>
-      </w:r>
-      <w:r>
-        <w:rPr>
-          <w:b/>
-          <w:bCs/>
-          <w:sz w:val="24"/>
-          <w:szCs w:val="24"/>
-        </w:rPr>
-        <w:t>CSB data</w:t>
-      </w:r>
-    </w:p>
-    <w:p>
-      <w:pPr>
-        <w:rPr>
-          <w:sz w:val="24"/>
-          <w:szCs w:val="24"/>
-        </w:rPr>
-      </w:pPr>
-      <w:proofErr w:type="spellStart"/>
-      <w:r>
-        <w:rPr>
-          <w:sz w:val="24"/>
-          <w:szCs w:val="24"/>
-        </w:rPr>
-        <w:t>download_csb</w:t>
-      </w:r>
-      <w:proofErr w:type="spellEnd"/>
-    </w:p>
-    <w:p>
-      <w:pPr>
-        <w:rPr>
-          <w:sz w:val="24"/>
-          <w:szCs w:val="24"/>
-        </w:rPr>
-      </w:pPr>
-      <w:proofErr w:type="spellStart"/>
-      <w:r>
-        <w:rPr>
-          <w:sz w:val="24"/>
-          <w:szCs w:val="24"/>
-        </w:rPr>
-        <w:t>clip_csb_shape</w:t>
-      </w:r>
-      <w:proofErr w:type="spellEnd"/>
-    </w:p>
-    <w:p>
-      <w:pPr>
-        <w:rPr>
-          <w:sz w:val="24"/>
-          <w:szCs w:val="24"/>
-        </w:rPr>
-      </w:pPr>
-      <w:proofErr w:type="spellStart"/>
-      <w:r>
-        <w:rPr>
-          <w:sz w:val="24"/>
-          <w:szCs w:val="24"/>
-        </w:rPr>
-        <w:t>split_csb_shape</w:t>
-      </w:r>
-      <w:r>
-        <w:rPr>
-          <w:sz w:val="24"/>
-          <w:szCs w:val="24"/>
-        </w:rPr>
-        <w:t>_table</w:t>
-      </w:r>
-      <w:proofErr w:type="spellEnd"/>
-    </w:p>
-    <w:p>
-      <w:pPr>
-        <w:rPr>
-          <w:sz w:val="24"/>
-          <w:szCs w:val="24"/>
-        </w:rPr>
-      </w:pPr>
-      <w:proofErr w:type="spellStart"/>
-      <w:r>
-        <w:rPr>
-          <w:sz w:val="24"/>
-          <w:szCs w:val="24"/>
-        </w:rPr>
-        <w:t>check_csb_shape_table</w:t>
-      </w:r>
-      <w:proofErr w:type="spellEnd"/>
-    </w:p>
-    <w:p>
-      <w:pPr>
-        <w:rPr>
-          <w:sz w:val="24"/>
-          <w:szCs w:val="24"/>
-        </w:rPr>
-      </w:pPr>
-      <w:proofErr w:type="spellStart"/>
-      <w:r>
-        <w:rPr>
-          <w:sz w:val="24"/>
-          <w:szCs w:val="24"/>
-        </w:rPr>
-        <w:t>rasterize_CSB_to_gSSURGO_grid</w:t>
-      </w:r>
-      <w:proofErr w:type="spellEnd"/>
-    </w:p>
-    <w:p>
-      <w:pPr>
-        <w:rPr>
-          <w:sz w:val="24"/>
-          <w:szCs w:val="24"/>
-        </w:rPr>
-      </w:pPr>
-    </w:p>
-    <w:p>
-      <w:pPr>
-        <w:spacing w:before="240"/>
-        <w:rPr>
-          <w:b/>
-          <w:bCs/>
-          <w:sz w:val="24"/>
-          <w:szCs w:val="24"/>
-        </w:rPr>
-      </w:pPr>
-      <w:r>
-        <w:rPr>
-          <w:b/>
-          <w:bCs/>
-          <w:sz w:val="24"/>
-          <w:szCs w:val="24"/>
-        </w:rPr>
-        <w:t>Chain of scripts to run to join CSB + DISES + supplementary data</w:t>
-      </w:r>
-    </w:p>
-    <w:p>
-      <w:pPr>
-        <w:rPr>
-          <w:sz w:val="24"/>
-          <w:szCs w:val="24"/>
-        </w:rPr>
-      </w:pPr>
-      <w:proofErr w:type="spellStart"/>
-      <w:r>
-        <w:rPr>
-          <w:sz w:val="24"/>
-          <w:szCs w:val="24"/>
-        </w:rPr>
-        <w:t>join_csb_dises</w:t>
-      </w:r>
-      <w:proofErr w:type="spellEnd"/>
-    </w:p>
-    <w:p>
-      <w:pPr>
-        <w:rPr>
-          <w:sz w:val="24"/>
-          <w:szCs w:val="24"/>
-        </w:rPr>
-      </w:pPr>
-      <w:proofErr w:type="spellStart"/>
+        <w:t>elevation_slope</w:t>
+      </w:r>
+    </w:p>
+    <w:p>
+      <w:pPr>
+        <w:rPr>
+          <w:sz w:val="24"/>
+          <w:szCs w:val="24"/>
+        </w:rPr>
+      </w:pPr>
       <w:r>
         <w:rPr>
           <w:sz w:val="24"/>
@@ -1120,80 +1092,16 @@
           <w:sz w:val="24"/>
           <w:szCs w:val="24"/>
         </w:rPr>
-        <w:t>census_tract</w:t>
-      </w:r>
-      <w:proofErr w:type="spellEnd"/>
-    </w:p>
-    <w:p>
-      <w:pPr>
-        <w:rPr>
-          <w:sz w:val="24"/>
-          <w:szCs w:val="24"/>
-        </w:rPr>
-      </w:pPr>
-      <w:proofErr w:type="spellStart"/>
-      <w:r>
-        <w:rPr>
-          <w:sz w:val="24"/>
-          <w:szCs w:val="24"/>
-        </w:rPr>
-        <w:t>join_csb</w:t>
-      </w:r>
-      <w:r>
-        <w:rPr>
-          <w:sz w:val="24"/>
-          <w:szCs w:val="24"/>
-        </w:rPr>
-        <w:t>_</w:t>
-      </w:r>
-      <w:r>
-        <w:rPr>
-          <w:sz w:val="24"/>
-          <w:szCs w:val="24"/>
-        </w:rPr>
-        <w:t>elevation_slope</w:t>
-      </w:r>
-      <w:proofErr w:type="spellEnd"/>
-    </w:p>
-    <w:p>
-      <w:pPr>
-        <w:rPr>
-          <w:sz w:val="24"/>
-          <w:szCs w:val="24"/>
-        </w:rPr>
-      </w:pPr>
-      <w:proofErr w:type="spellStart"/>
-      <w:r>
-        <w:rPr>
-          <w:sz w:val="24"/>
-          <w:szCs w:val="24"/>
-        </w:rPr>
-        <w:t>join_csb</w:t>
-      </w:r>
-      <w:r>
-        <w:rPr>
-          <w:sz w:val="24"/>
-          <w:szCs w:val="24"/>
-        </w:rPr>
-        <w:t>_</w:t>
-      </w:r>
-      <w:r>
-        <w:rPr>
-          <w:sz w:val="24"/>
-          <w:szCs w:val="24"/>
-        </w:rPr>
         <w:t>watershed</w:t>
       </w:r>
-      <w:proofErr w:type="spellEnd"/>
-    </w:p>
-    <w:p>
-      <w:pPr>
-        <w:rPr>
-          <w:sz w:val="24"/>
-          <w:szCs w:val="24"/>
-        </w:rPr>
-      </w:pPr>
-      <w:proofErr w:type="spellStart"/>
+    </w:p>
+    <w:p>
+      <w:pPr>
+        <w:rPr>
+          <w:sz w:val="24"/>
+          <w:szCs w:val="24"/>
+        </w:rPr>
+      </w:pPr>
       <w:r>
         <w:rPr>
           <w:sz w:val="24"/>
@@ -1209,16 +1117,14 @@
         </w:rPr>
         <w:t>_nearest_roads</w:t>
       </w:r>
-      <w:proofErr w:type="spellEnd"/>
-    </w:p>
-    <w:p>
-      <w:pPr>
-        <w:rPr>
-          <w:sz w:val="24"/>
-          <w:szCs w:val="24"/>
-        </w:rPr>
-      </w:pPr>
-      <w:proofErr w:type="spellStart"/>
+    </w:p>
+    <w:p>
+      <w:pPr>
+        <w:rPr>
+          <w:sz w:val="24"/>
+          <w:szCs w:val="24"/>
+        </w:rPr>
+      </w:pPr>
       <w:r>
         <w:rPr>
           <w:sz w:val="24"/>
@@ -1233,16 +1139,14 @@
         </w:rPr>
         <w:t>_neighbor_field_mgmt</w:t>
       </w:r>
-      <w:proofErr w:type="spellEnd"/>
-    </w:p>
-    <w:p>
-      <w:pPr>
-        <w:rPr>
-          <w:sz w:val="24"/>
-          <w:szCs w:val="24"/>
-        </w:rPr>
-      </w:pPr>
-      <w:proofErr w:type="spellStart"/>
+    </w:p>
+    <w:p>
+      <w:pPr>
+        <w:rPr>
+          <w:sz w:val="24"/>
+          <w:szCs w:val="24"/>
+        </w:rPr>
+      </w:pPr>
       <w:r>
         <w:rPr>
           <w:sz w:val="24"/>
@@ -1257,16 +1161,14 @@
         </w:rPr>
         <w:t>_weather</w:t>
       </w:r>
-      <w:proofErr w:type="spellEnd"/>
-    </w:p>
-    <w:p>
-      <w:pPr>
-        <w:rPr>
-          <w:sz w:val="24"/>
-          <w:szCs w:val="24"/>
-        </w:rPr>
-      </w:pPr>
-      <w:proofErr w:type="spellStart"/>
+    </w:p>
+    <w:p>
+      <w:pPr>
+        <w:rPr>
+          <w:sz w:val="24"/>
+          <w:szCs w:val="24"/>
+        </w:rPr>
+      </w:pPr>
       <w:r>
         <w:rPr>
           <w:sz w:val="24"/>
@@ -1281,16 +1183,14 @@
         </w:rPr>
         <w:t>crop_prices</w:t>
       </w:r>
-      <w:proofErr w:type="spellEnd"/>
-    </w:p>
-    <w:p>
-      <w:pPr>
-        <w:rPr>
-          <w:sz w:val="24"/>
-          <w:szCs w:val="24"/>
-        </w:rPr>
-      </w:pPr>
-      <w:proofErr w:type="spellStart"/>
+    </w:p>
+    <w:p>
+      <w:pPr>
+        <w:rPr>
+          <w:sz w:val="24"/>
+          <w:szCs w:val="24"/>
+        </w:rPr>
+      </w:pPr>
       <w:r>
         <w:rPr>
           <w:sz w:val="24"/>
@@ -1305,16 +1205,14 @@
         </w:rPr>
         <w:t>crop_prices</w:t>
       </w:r>
-      <w:proofErr w:type="spellEnd"/>
-    </w:p>
-    <w:p>
-      <w:pPr>
-        <w:rPr>
-          <w:sz w:val="24"/>
-          <w:szCs w:val="24"/>
-        </w:rPr>
-      </w:pPr>
-      <w:proofErr w:type="spellStart"/>
+    </w:p>
+    <w:p>
+      <w:pPr>
+        <w:rPr>
+          <w:sz w:val="24"/>
+          <w:szCs w:val="24"/>
+        </w:rPr>
+      </w:pPr>
       <w:r>
         <w:rPr>
           <w:sz w:val="24"/>
@@ -1327,25 +1225,16 @@
           <w:sz w:val="24"/>
           <w:szCs w:val="24"/>
         </w:rPr>
-        <w:t>_</w:t>
-      </w:r>
-      <w:r>
-        <w:rPr>
-          <w:sz w:val="24"/>
-          <w:szCs w:val="24"/>
-        </w:rPr>
-        <w:t>soil_composition</w:t>
-      </w:r>
-      <w:proofErr w:type="spellEnd"/>
-    </w:p>
-    <w:p>
-      <w:pPr>
-        <w:rPr>
-          <w:sz w:val="24"/>
-          <w:szCs w:val="24"/>
-        </w:rPr>
-      </w:pPr>
-      <w:proofErr w:type="spellStart"/>
+        <w:t>_soil_composition</w:t>
+      </w:r>
+    </w:p>
+    <w:p>
+      <w:pPr>
+        <w:rPr>
+          <w:sz w:val="24"/>
+          <w:szCs w:val="24"/>
+        </w:rPr>
+      </w:pPr>
       <w:r>
         <w:rPr>
           <w:sz w:val="24"/>
@@ -1358,16 +1247,8 @@
           <w:sz w:val="24"/>
           <w:szCs w:val="24"/>
         </w:rPr>
-        <w:t>_</w:t>
-      </w:r>
-      <w:r>
-        <w:rPr>
-          <w:sz w:val="24"/>
-          <w:szCs w:val="24"/>
-        </w:rPr>
-        <w:t>ag_census</w:t>
-      </w:r>
-      <w:proofErr w:type="spellEnd"/>
+        <w:t>_ag_census</w:t>
+      </w:r>
     </w:p>
     <w:p>
       <w:pPr>
@@ -1432,7 +1313,6 @@
           <w:szCs w:val="24"/>
         </w:rPr>
       </w:pPr>
-      <w:proofErr w:type="spellStart"/>
       <w:r>
         <w:rPr>
           <w:sz w:val="24"/>
@@ -1440,16 +1320,14 @@
         </w:rPr>
         <w:t>download_cdl</w:t>
       </w:r>
-      <w:proofErr w:type="spellEnd"/>
-    </w:p>
-    <w:p>
-      <w:pPr>
-        <w:rPr>
-          <w:sz w:val="24"/>
-          <w:szCs w:val="24"/>
-        </w:rPr>
-      </w:pPr>
-      <w:proofErr w:type="spellStart"/>
+    </w:p>
+    <w:p>
+      <w:pPr>
+        <w:rPr>
+          <w:sz w:val="24"/>
+          <w:szCs w:val="24"/>
+        </w:rPr>
+      </w:pPr>
       <w:r>
         <w:rPr>
           <w:sz w:val="24"/>
@@ -1457,16 +1335,14 @@
         </w:rPr>
         <w:t>clip_cdl_rasters</w:t>
       </w:r>
-      <w:proofErr w:type="spellEnd"/>
-    </w:p>
-    <w:p>
-      <w:pPr>
-        <w:rPr>
-          <w:sz w:val="24"/>
-          <w:szCs w:val="24"/>
-        </w:rPr>
-      </w:pPr>
-      <w:proofErr w:type="spellStart"/>
+    </w:p>
+    <w:p>
+      <w:pPr>
+        <w:rPr>
+          <w:sz w:val="24"/>
+          <w:szCs w:val="24"/>
+        </w:rPr>
+      </w:pPr>
       <w:r>
         <w:rPr>
           <w:sz w:val="24"/>
@@ -1481,16 +1357,14 @@
         </w:rPr>
         <w:t>_grid</w:t>
       </w:r>
-      <w:proofErr w:type="spellEnd"/>
-    </w:p>
-    <w:p>
-      <w:pPr>
-        <w:rPr>
-          <w:sz w:val="24"/>
-          <w:szCs w:val="24"/>
-        </w:rPr>
-      </w:pPr>
-      <w:proofErr w:type="spellStart"/>
+    </w:p>
+    <w:p>
+      <w:pPr>
+        <w:rPr>
+          <w:sz w:val="24"/>
+          <w:szCs w:val="24"/>
+        </w:rPr>
+      </w:pPr>
       <w:r>
         <w:rPr>
           <w:sz w:val="24"/>
@@ -1498,16 +1372,14 @@
         </w:rPr>
         <w:t>join_regrow_cdl</w:t>
       </w:r>
-      <w:proofErr w:type="spellEnd"/>
-    </w:p>
-    <w:p>
-      <w:pPr>
-        <w:rPr>
-          <w:sz w:val="24"/>
-          <w:szCs w:val="24"/>
-        </w:rPr>
-      </w:pPr>
-      <w:proofErr w:type="spellStart"/>
+    </w:p>
+    <w:p>
+      <w:pPr>
+        <w:rPr>
+          <w:sz w:val="24"/>
+          <w:szCs w:val="24"/>
+        </w:rPr>
+      </w:pPr>
       <w:r>
         <w:rPr>
           <w:sz w:val="24"/>
@@ -1522,7 +1394,6 @@
         </w:rPr>
         <w:t>crop_with_cdl</w:t>
       </w:r>
-      <w:proofErr w:type="spellEnd"/>
       <w:r>
         <w:rPr>
           <w:sz w:val="24"/>
@@ -1550,7 +1421,7 @@
 </file>
 
 <file path=word/styles.xml><?xml version="1.0" encoding="utf-8"?>
-<w:styles xmlns:mc="http://schemas.openxmlformats.org/markup-compatibility/2006" xmlns:r="http://schemas.openxmlformats.org/officeDocument/2006/relationships" xmlns:w="http://schemas.openxmlformats.org/wordprocessingml/2006/main" xmlns:w14="http://schemas.microsoft.com/office/word/2010/wordml" xmlns:w15="http://schemas.microsoft.com/office/word/2012/wordml" xmlns:w16cex="http://schemas.microsoft.com/office/word/2018/wordml/cex" xmlns:w16cid="http://schemas.microsoft.com/office/word/2016/wordml/cid" xmlns:w16="http://schemas.microsoft.com/office/word/2018/wordml" xmlns:w16sdtdh="http://schemas.microsoft.com/office/word/2020/wordml/sdtdatahash" xmlns:w16se="http://schemas.microsoft.com/office/word/2015/wordml/symex" mc:Ignorable="w14 w15 w16se w16cid w16 w16cex w16sdtdh">
+<w:styles xmlns:mc="http://schemas.openxmlformats.org/markup-compatibility/2006" xmlns:r="http://schemas.openxmlformats.org/officeDocument/2006/relationships" xmlns:w="http://schemas.openxmlformats.org/wordprocessingml/2006/main" xmlns:w14="http://schemas.microsoft.com/office/word/2010/wordml" xmlns:w15="http://schemas.microsoft.com/office/word/2012/wordml" xmlns:w16cex="http://schemas.microsoft.com/office/word/2018/wordml/cex" xmlns:w16cid="http://schemas.microsoft.com/office/word/2016/wordml/cid" xmlns:w16="http://schemas.microsoft.com/office/word/2018/wordml" xmlns:w16du="http://schemas.microsoft.com/office/word/2023/wordml/word16du" xmlns:w16sdtdh="http://schemas.microsoft.com/office/word/2020/wordml/sdtdatahash" xmlns:w16sdtfl="http://schemas.microsoft.com/office/word/2024/wordml/sdtformatlock" xmlns:w16se="http://schemas.microsoft.com/office/word/2015/wordml/symex" mc:Ignorable="w14 w15 w16se w16cid w16 w16cex w16sdtdh w16sdtfl w16du">
   <w:docDefaults>
     <w:rPrDefault>
       <w:rPr>

</xml_diff>